<commit_message>
Add Risk Register/organizational-memory capability to one-pager
Documents the Risk Pattern Library capability (risks matched from
prior programs, surfaced before generation and fed into the Risk
Register Agent's prompt) alongside the other 9 capabilities.

Co-Authored-By: Claude Sonnet 5 <noreply@anthropic.com>
Claude-Session: https://claude.ai/code/session_014YccidrEp6ATN1ZCYA8Q2h
</commit_message>
<xml_diff>
--- a/agentic-pmo-suite/Agentic-PMO-Suite-Overview.docx
+++ b/agentic-pmo-suite/Agentic-PMO-Suite-Overview.docx
@@ -705,7 +705,7 @@
                 <w:sz w:val="16"/>
                 <w:szCs w:val="16"/>
               </w:rPr>
-              <w:t xml:space="preserve">Voice / Transcript Intake</w:t>
+              <w:t xml:space="preserve">Risk Register with Organizational Memory</w:t>
             </w:r>
           </w:p>
         </w:tc>
@@ -731,7 +731,7 @@
                 <w:sz w:val="16"/>
                 <w:szCs w:val="16"/>
               </w:rPr>
-              <w:t xml:space="preserve">A requester can paste a meeting transcript (or use best-effort live dictation) and a Transcript Parser Agent fills the intake form fields directly.</w:t>
+              <w:t xml:space="preserve">A seeded Risk Pattern Library of risks tagged by initiative type, teams, size, and domain keywords is matched against each new program and surfaced before generation; the Risk Register Agent is told to include matched patterns first, adapted to the specifics, then add net-new risks.</w:t>
             </w:r>
           </w:p>
         </w:tc>
@@ -759,7 +759,7 @@
                 <w:sz w:val="16"/>
                 <w:szCs w:val="16"/>
               </w:rPr>
-              <w:t xml:space="preserve">Removes the “yet another form” friction that quietly degrades request quality and discourages submission altogether.</w:t>
+              <w:t xml:space="preserve">Recurring risks (vendor-change breaks, cutover data drift, API compatibility gaps) get caught because the system remembers them — not because an agent happens to reinvent them correctly each time.</w:t>
             </w:r>
           </w:p>
         </w:tc>
@@ -789,7 +789,7 @@
                 <w:sz w:val="16"/>
                 <w:szCs w:val="16"/>
               </w:rPr>
-              <w:t xml:space="preserve">OKR / Metric Consistency Check</w:t>
+              <w:t xml:space="preserve">Voice / Transcript Intake</w:t>
             </w:r>
           </w:p>
         </w:tc>
@@ -815,7 +815,7 @@
                 <w:sz w:val="16"/>
                 <w:szCs w:val="16"/>
               </w:rPr>
-              <w:t xml:space="preserve">A structural, rule-based check (not an agent) flags when a program's named OKR doesn't actually match the category of metric it's tracking (e.g., a cost-reduction OKR paired with churn-risk figures).</w:t>
+              <w:t xml:space="preserve">A requester can paste a meeting transcript (or use best-effort live dictation) and a Transcript Parser Agent fills the intake form fields directly.</w:t>
             </w:r>
           </w:p>
         </w:tc>
@@ -843,7 +843,7 @@
                 <w:sz w:val="16"/>
                 <w:szCs w:val="16"/>
               </w:rPr>
-              <w:t xml:space="preserve">Catches a real data-quality gap systematically and every time, rather than hoping an agent happens to notice it.</w:t>
+              <w:t xml:space="preserve">Removes the “yet another form” friction that quietly degrades request quality and discourages submission altogether.</w:t>
             </w:r>
           </w:p>
         </w:tc>
@@ -873,7 +873,7 @@
                 <w:sz w:val="16"/>
                 <w:szCs w:val="16"/>
               </w:rPr>
-              <w:t xml:space="preserve">Consolidated Program Tracker</w:t>
+              <w:t xml:space="preserve">OKR / Metric Consistency Check</w:t>
             </w:r>
           </w:p>
         </w:tc>
@@ -899,7 +899,7 @@
                 <w:sz w:val="16"/>
                 <w:szCs w:val="16"/>
               </w:rPr>
-              <w:t xml:space="preserve">One portfolio view of every active program — RAG status, phase, budget, TPM allocation, and prioritization score — alongside full detail in each program's own tab.</w:t>
+              <w:t xml:space="preserve">A structural, rule-based check (not an agent) flags when a program's named OKR doesn't actually match the category of metric it's tracking (e.g., a cost-reduction OKR paired with churn-risk figures).</w:t>
             </w:r>
           </w:p>
         </w:tc>
@@ -907,6 +907,90 @@
           <w:tcPr>
             <w:tcW w:type="dxa" w:w="3450"/>
             <w:shd w:fill="EEF2F6" w:val="clear"/>
+            <w:tcMar>
+              <w:top w:type="dxa" w:w="80"/>
+              <w:left w:type="dxa" w:w="100"/>
+              <w:bottom w:type="dxa" w:w="80"/>
+              <w:right w:type="dxa" w:w="100"/>
+            </w:tcMar>
+            <w:vAlign w:val="top"/>
+          </w:tcPr>
+          <w:p>
+            <w:pPr>
+              <w:spacing w:after="0"/>
+            </w:pPr>
+            <w:r>
+              <w:rPr>
+                <w:i/>
+                <w:iCs/>
+                <w:color w:val="5A6472"/>
+                <w:sz w:val="16"/>
+                <w:szCs w:val="16"/>
+              </w:rPr>
+              <w:t xml:space="preserve">Catches a real data-quality gap systematically and every time, rather than hoping an agent happens to notice it.</w:t>
+            </w:r>
+          </w:p>
+        </w:tc>
+      </w:tr>
+      <w:tr>
+        <w:tc>
+          <w:tcPr>
+            <w:tcW w:type="dxa" w:w="2050"/>
+            <w:shd w:fill="FFFFFF" w:val="clear"/>
+            <w:tcMar>
+              <w:top w:type="dxa" w:w="80"/>
+              <w:left w:type="dxa" w:w="100"/>
+              <w:bottom w:type="dxa" w:w="80"/>
+              <w:right w:type="dxa" w:w="100"/>
+            </w:tcMar>
+            <w:vAlign w:val="top"/>
+          </w:tcPr>
+          <w:p>
+            <w:pPr>
+              <w:spacing w:after="0"/>
+            </w:pPr>
+            <w:r>
+              <w:rPr>
+                <w:b/>
+                <w:bCs/>
+                <w:color w:val="2E5F8A"/>
+                <w:sz w:val="16"/>
+                <w:szCs w:val="16"/>
+              </w:rPr>
+              <w:t xml:space="preserve">Consolidated Program Tracker</w:t>
+            </w:r>
+          </w:p>
+        </w:tc>
+        <w:tc>
+          <w:tcPr>
+            <w:tcW w:type="dxa" w:w="4700"/>
+            <w:shd w:fill="FFFFFF" w:val="clear"/>
+            <w:tcMar>
+              <w:top w:type="dxa" w:w="80"/>
+              <w:left w:type="dxa" w:w="100"/>
+              <w:bottom w:type="dxa" w:w="80"/>
+              <w:right w:type="dxa" w:w="100"/>
+            </w:tcMar>
+            <w:vAlign w:val="top"/>
+          </w:tcPr>
+          <w:p>
+            <w:pPr>
+              <w:spacing w:after="0"/>
+            </w:pPr>
+            <w:r>
+              <w:rPr>
+                <w:color w:val="222222"/>
+                <w:sz w:val="16"/>
+                <w:szCs w:val="16"/>
+              </w:rPr>
+              <w:t xml:space="preserve">One portfolio view of every active program — RAG status, phase, budget, TPM allocation, and prioritization score — alongside full detail in each program's own tab.</w:t>
+            </w:r>
+          </w:p>
+        </w:tc>
+        <w:tc>
+          <w:tcPr>
+            <w:tcW w:type="dxa" w:w="3450"/>
+            <w:shd w:fill="FFFFFF" w:val="clear"/>
             <w:tcMar>
               <w:top w:type="dxa" w:w="80"/>
               <w:left w:type="dxa" w:w="100"/>

</xml_diff>

<commit_message>
Label one-pager as WIP/prototype, correct audit-trail overclaim
Adds a visible "Work in Progress — Prototype" status line with the
honest scope percentages, and corrects the Human Override row, which
previously implied a full audit trail exists; it doesn't yet (badged
and reversible overrides do, a timestamped log does not).

Co-Authored-By: Claude Sonnet 5 <noreply@anthropic.com>
Claude-Session: https://claude.ai/code/session_014YccidrEp6ATN1ZCYA8Q2h
</commit_message>
<xml_diff>
--- a/agentic-pmo-suite/Agentic-PMO-Suite-Overview.docx
+++ b/agentic-pmo-suite/Agentic-PMO-Suite-Overview.docx
@@ -19,7 +19,7 @@
     </w:p>
     <w:p>
       <w:pPr>
-        <w:spacing w:after="140"/>
+        <w:spacing w:after="100"/>
       </w:pPr>
       <w:r>
         <w:rPr>
@@ -34,6 +34,31 @@
     </w:p>
     <w:p>
       <w:pPr>
+        <w:spacing w:after="160"/>
+      </w:pPr>
+      <w:r>
+        <w:rPr>
+          <w:b/>
+          <w:bCs/>
+          <w:color w:val="9A6A1A"/>
+          <w:sz w:val="15"/>
+          <w:szCs w:val="15"/>
+        </w:rPr>
+        <w:t xml:space="preserve">STATUS: WORK IN PROGRESS — PROTOTYPE, NOT A FINISHED PRODUCT</w:t>
+      </w:r>
+      <w:r>
+        <w:rPr>
+          <w:i/>
+          <w:iCs/>
+          <w:color w:val="5A6472"/>
+          <w:sz w:val="15"/>
+          <w:szCs w:val="15"/>
+        </w:rPr>
+        <w:t xml:space="preserve">   ~75–80% of its own scoped goal; ~35–40% of a full enterprise PfMO function. Full breakdown in the app's own Roadmap &amp; Scope tab.</w:t>
+      </w:r>
+    </w:p>
+    <w:p>
+      <w:pPr>
         <w:pBdr>
           <w:bottom w:val="single" w:color="2E5F8A" w:sz="6" w:space="4"/>
         </w:pBdr>
@@ -67,7 +92,7 @@
           <w:sz w:val="18"/>
           <w:szCs w:val="18"/>
         </w:rPr>
-        <w:t xml:space="preserve">PMOs run on the same handful of artifacts — charters, plans, status reports, risk registers — rewritten by hand for every program, and prioritization decisions that are hard to defend when leadership asks “why this and not that?” This suite uses a set of purpose-built AI agents, not one generic chatbot, to draft each artifact consistently and to score prioritization against a fixed, OKR-gated rubric — while keeping a human override and audit trail on every decision that matters.</w:t>
+        <w:t xml:space="preserve">PMOs run on the same handful of artifacts — charters, plans, status reports, risk registers — rewritten by hand for every program, and prioritization decisions that are hard to defend when leadership asks “why this and not that?” This suite uses a set of purpose-built AI agents, not one generic chatbot, to draft each artifact consistently and to score prioritization against a fixed, OKR-gated rubric — while keeping every override badged and reversible back to the agent's original assessment.</w:t>
       </w:r>
     </w:p>
     <w:tbl>
@@ -453,7 +478,7 @@
                 <w:sz w:val="16"/>
                 <w:szCs w:val="16"/>
               </w:rPr>
-              <w:t xml:space="preserve">Human Override, Fully Auditable</w:t>
+              <w:t xml:space="preserve">Human Override, Badged &amp; Reversible</w:t>
             </w:r>
           </w:p>
         </w:tc>
@@ -479,7 +504,7 @@
                 <w:sz w:val="16"/>
                 <w:szCs w:val="16"/>
               </w:rPr>
-              <w:t xml:space="preserve">Any agent score or drafted content can be overridden by a PMO or engineering leader. Overrides are clearly badged and always revertible back to the agent's original assessment.</w:t>
+              <w:t xml:space="preserve">Any agent score or drafted content can be overridden by a PMO or engineering leader. Overrides are clearly badged and always revertible back to the agent's original assessment. (A timestamped who/when/why audit log is roadmapped, not yet built.)</w:t>
             </w:r>
           </w:p>
         </w:tc>

</xml_diff>

<commit_message>
Add the rigor meter to the overview and PfMO function map one-pagers
Co-Authored-By: Claude Opus 5.5 <noreply@anthropic.com>
Claude-Session: https://claude.ai/code/session_01MnXz6PZ1Ge6ZATXi1Jjz6p
</commit_message>
<xml_diff>
--- a/agentic-pmo-suite/Agentic-PMO-Suite-Overview.docx
+++ b/agentic-pmo-suite/Agentic-PMO-Suite-Overview.docx
@@ -646,7 +646,7 @@
                 <w:sz w:val="16"/>
                 <w:szCs w:val="16"/>
               </w:rPr>
-              <w:t xml:space="preserve">Seven Grounded Artifact Agents</w:t>
+              <w:t xml:space="preserve">Rigor Meter (Right-Sized Process)</w:t>
             </w:r>
           </w:p>
         </w:tc>
@@ -672,7 +672,7 @@
                 <w:sz w:val="16"/>
                 <w:szCs w:val="16"/>
               </w:rPr>
-              <w:t xml:space="preserve">Charter, Project Plan, Status Report, Risk Register, Dependency Tracker, OKR Report, and Program Landing Page — each drafted from one shared, real program-context object and a fixed section template.</w:t>
+              <w:t xml:space="preserve">Scores each program on complexity, integration, the parts of the stack it touches, and release type (0–8) to set a high, medium or low rigor level, each with a recommended process. A leader can override the level; the override is badged, revertible, and written to the audit log.</w:t>
             </w:r>
           </w:p>
         </w:tc>
@@ -700,7 +700,7 @@
                 <w:sz w:val="16"/>
                 <w:szCs w:val="16"/>
               </w:rPr>
-              <w:t xml:space="preserve">Every artifact says the same thing about the same program. No drift between what the charter promises and what the status report reports.</w:t>
+              <w:t xml:space="preserve">Process fits the work: small releases stop carrying waterfall overhead, and long, multi-team programs get the control they need.</w:t>
             </w:r>
           </w:p>
         </w:tc>
@@ -730,7 +730,7 @@
                 <w:sz w:val="16"/>
                 <w:szCs w:val="16"/>
               </w:rPr>
-              <w:t xml:space="preserve">Risk Register with Organizational Memory</w:t>
+              <w:t xml:space="preserve">Seven Grounded Artifact Agents</w:t>
             </w:r>
           </w:p>
         </w:tc>
@@ -756,7 +756,7 @@
                 <w:sz w:val="16"/>
                 <w:szCs w:val="16"/>
               </w:rPr>
-              <w:t xml:space="preserve">A seeded Risk Pattern Library of risks tagged by initiative type, teams, size, and domain keywords is matched against each new program and surfaced before generation; the Risk Register Agent is told to include matched patterns first, adapted to the specifics, then add net-new risks.</w:t>
+              <w:t xml:space="preserve">Charter, Project Plan, Status Report, Risk Register, Dependency Tracker, OKR Report, and Program Landing Page — each drafted from one shared, real program-context object and a fixed section template.</w:t>
             </w:r>
           </w:p>
         </w:tc>
@@ -784,7 +784,7 @@
                 <w:sz w:val="16"/>
                 <w:szCs w:val="16"/>
               </w:rPr>
-              <w:t xml:space="preserve">Recurring risks (vendor-change breaks, cutover data drift, API compatibility gaps) get caught because the system remembers them — not because an agent happens to reinvent them correctly each time.</w:t>
+              <w:t xml:space="preserve">Every artifact says the same thing about the same program. No drift between what the charter promises and what the status report reports.</w:t>
             </w:r>
           </w:p>
         </w:tc>
@@ -814,7 +814,7 @@
                 <w:sz w:val="16"/>
                 <w:szCs w:val="16"/>
               </w:rPr>
-              <w:t xml:space="preserve">Voice / Transcript Intake</w:t>
+              <w:t xml:space="preserve">Risk Register with Organizational Memory</w:t>
             </w:r>
           </w:p>
         </w:tc>
@@ -840,7 +840,7 @@
                 <w:sz w:val="16"/>
                 <w:szCs w:val="16"/>
               </w:rPr>
-              <w:t xml:space="preserve">A requester can paste a meeting transcript (or use best-effort live dictation) and a Transcript Parser Agent fills the intake form fields directly.</w:t>
+              <w:t xml:space="preserve">A seeded Risk Pattern Library of risks tagged by initiative type, teams, size, and domain keywords is matched against each new program and surfaced before generation; the Risk Register Agent is told to include matched patterns first, adapted to the specifics, then add net-new risks.</w:t>
             </w:r>
           </w:p>
         </w:tc>
@@ -868,7 +868,7 @@
                 <w:sz w:val="16"/>
                 <w:szCs w:val="16"/>
               </w:rPr>
-              <w:t xml:space="preserve">Removes the “yet another form” friction that quietly degrades request quality and discourages submission altogether.</w:t>
+              <w:t xml:space="preserve">Recurring risks (vendor-change breaks, cutover data drift, API compatibility gaps) get caught because the system remembers them — not because an agent happens to reinvent them correctly each time.</w:t>
             </w:r>
           </w:p>
         </w:tc>
@@ -898,7 +898,7 @@
                 <w:sz w:val="16"/>
                 <w:szCs w:val="16"/>
               </w:rPr>
-              <w:t xml:space="preserve">OKR / Metric Consistency Check</w:t>
+              <w:t xml:space="preserve">Voice / Transcript Intake</w:t>
             </w:r>
           </w:p>
         </w:tc>
@@ -924,7 +924,7 @@
                 <w:sz w:val="16"/>
                 <w:szCs w:val="16"/>
               </w:rPr>
-              <w:t xml:space="preserve">A structural, rule-based check (not an agent) flags when a program's named OKR doesn't actually match the category of metric it's tracking (e.g., a cost-reduction OKR paired with churn-risk figures).</w:t>
+              <w:t xml:space="preserve">A requester can paste a meeting transcript (or use best-effort live dictation) and a Transcript Parser Agent fills the intake form fields directly.</w:t>
             </w:r>
           </w:p>
         </w:tc>
@@ -952,7 +952,7 @@
                 <w:sz w:val="16"/>
                 <w:szCs w:val="16"/>
               </w:rPr>
-              <w:t xml:space="preserve">Catches a real data-quality gap systematically and every time, rather than hoping an agent happens to notice it.</w:t>
+              <w:t xml:space="preserve">Removes the “yet another form” friction that quietly degrades request quality and discourages submission altogether.</w:t>
             </w:r>
           </w:p>
         </w:tc>
@@ -982,7 +982,7 @@
                 <w:sz w:val="16"/>
                 <w:szCs w:val="16"/>
               </w:rPr>
-              <w:t xml:space="preserve">Consolidated Program Tracker</w:t>
+              <w:t xml:space="preserve">OKR / Metric Consistency Check</w:t>
             </w:r>
           </w:p>
         </w:tc>
@@ -1008,7 +1008,7 @@
                 <w:sz w:val="16"/>
                 <w:szCs w:val="16"/>
               </w:rPr>
-              <w:t xml:space="preserve">One portfolio view of every active program — RAG status, phase, budget, TPM allocation, and prioritization score — alongside full detail in each program's own tab.</w:t>
+              <w:t xml:space="preserve">A structural, rule-based check (not an agent) flags when a program's named OKR doesn't actually match the category of metric it's tracking (e.g., a cost-reduction OKR paired with churn-risk figures).</w:t>
             </w:r>
           </w:p>
         </w:tc>
@@ -1016,6 +1016,90 @@
           <w:tcPr>
             <w:tcW w:type="dxa" w:w="3450"/>
             <w:shd w:fill="FFFFFF" w:val="clear"/>
+            <w:tcMar>
+              <w:top w:type="dxa" w:w="80"/>
+              <w:left w:type="dxa" w:w="100"/>
+              <w:bottom w:type="dxa" w:w="80"/>
+              <w:right w:type="dxa" w:w="100"/>
+            </w:tcMar>
+            <w:vAlign w:val="top"/>
+          </w:tcPr>
+          <w:p>
+            <w:pPr>
+              <w:spacing w:after="0"/>
+            </w:pPr>
+            <w:r>
+              <w:rPr>
+                <w:i/>
+                <w:iCs/>
+                <w:color w:val="5A6472"/>
+                <w:sz w:val="16"/>
+                <w:szCs w:val="16"/>
+              </w:rPr>
+              <w:t xml:space="preserve">Catches a real data-quality gap systematically and every time, rather than hoping an agent happens to notice it.</w:t>
+            </w:r>
+          </w:p>
+        </w:tc>
+      </w:tr>
+      <w:tr>
+        <w:tc>
+          <w:tcPr>
+            <w:tcW w:type="dxa" w:w="2050"/>
+            <w:shd w:fill="EEF2F6" w:val="clear"/>
+            <w:tcMar>
+              <w:top w:type="dxa" w:w="80"/>
+              <w:left w:type="dxa" w:w="100"/>
+              <w:bottom w:type="dxa" w:w="80"/>
+              <w:right w:type="dxa" w:w="100"/>
+            </w:tcMar>
+            <w:vAlign w:val="top"/>
+          </w:tcPr>
+          <w:p>
+            <w:pPr>
+              <w:spacing w:after="0"/>
+            </w:pPr>
+            <w:r>
+              <w:rPr>
+                <w:b/>
+                <w:bCs/>
+                <w:color w:val="2E5F8A"/>
+                <w:sz w:val="16"/>
+                <w:szCs w:val="16"/>
+              </w:rPr>
+              <w:t xml:space="preserve">Consolidated Program Tracker</w:t>
+            </w:r>
+          </w:p>
+        </w:tc>
+        <w:tc>
+          <w:tcPr>
+            <w:tcW w:type="dxa" w:w="4700"/>
+            <w:shd w:fill="EEF2F6" w:val="clear"/>
+            <w:tcMar>
+              <w:top w:type="dxa" w:w="80"/>
+              <w:left w:type="dxa" w:w="100"/>
+              <w:bottom w:type="dxa" w:w="80"/>
+              <w:right w:type="dxa" w:w="100"/>
+            </w:tcMar>
+            <w:vAlign w:val="top"/>
+          </w:tcPr>
+          <w:p>
+            <w:pPr>
+              <w:spacing w:after="0"/>
+            </w:pPr>
+            <w:r>
+              <w:rPr>
+                <w:color w:val="222222"/>
+                <w:sz w:val="16"/>
+                <w:szCs w:val="16"/>
+              </w:rPr>
+              <w:t xml:space="preserve">One portfolio view of every active program — RAG status, phase, budget, TPM allocation, and prioritization score — alongside full detail in each program's own tab.</w:t>
+            </w:r>
+          </w:p>
+        </w:tc>
+        <w:tc>
+          <w:tcPr>
+            <w:tcW w:type="dxa" w:w="3450"/>
+            <w:shd w:fill="EEF2F6" w:val="clear"/>
             <w:tcMar>
               <w:top w:type="dxa" w:w="80"/>
               <w:left w:type="dxa" w:w="100"/>

</xml_diff>